<commit_message>
Published-note calibration: lead bullets, PDF style corpus, credits
The published q3-2026 Anthropic note confirms drafting conventions: Key
takeaways bullets open with a bold thesis sentence (new lead_bullets block
kind in grammar/builder/QA), byline is 'Senior Research Analyst, Late-Stage
Company Research'. Style profiler now ingests PDFs (pdftotext) so the three
uploaded published reports teach sentence geometry and evidence density.
Proof note rebuilt with both fixes.

Co-Authored-By: Claude Fable 5 <noreply@anthropic.com>
Claude-Session: https://claude.ai/code/session_01HodnyjbWZhifkSggmc88nP
</commit_message>
<xml_diff>
--- a/reports/databricks-vertical-note-2026-08-11/output/Q3_2026_Databricks_Vertical_Analyst_Note.docx
+++ b/reports/databricks-vertical-note-2026-08-11/output/Q3_2026_Databricks_Vertical_Analyst_Note.docx
@@ -188,7 +188,7 @@
         <w:rPr>
           <w:sz w:val="20"/>
         </w:rPr>
-        <w:t>HARRISON ROLFES  Senior Research Director</w:t>
+        <w:t>HARRISON ROLFES  Senior Research Analyst, Late-Stage Company Research</w:t>
       </w:r>
     </w:p>
     <w:p>
@@ -406,57 +406,89 @@
     <w:p>
       <w:pPr>
         <w:pStyle w:val="ListBullet"/>
-        <w:spacing w:after="80"/>
+        <w:spacing w:after="120"/>
         <w:ind w:left="403"/>
       </w:pPr>
       <w:r>
         <w:rPr>
-          <w:color w:val="262B35"/>
-          <w:sz w:val="21"/>
+          <w:b/>
+          <w:color w:val="1A1A1A"/>
+          <w:sz w:val="20"/>
         </w:rPr>
-        <w:t>Databricks signed a term sheet on July 17 for a strategic round at a $188 billion post-money valuation, led by existing investor Coatue; press reports place the size near $3 billion, and the company expects the close later this summer (company announcement, July 17, 2026).</w:t>
+        <w:t xml:space="preserve">Databricks signed at $188 billion, and the money is not in hand. </w:t>
+      </w:r>
+      <w:r>
+        <w:rPr>
+          <w:color w:val="1A1A1A"/>
+          <w:sz w:val="20"/>
+        </w:rPr>
+        <w:t>The July 17 term sheet for a strategic round is led by existing investor Coatue; press reports place the size near $3 billion, and the company expects the close later this summer (company announcement, July 17, 2026).</w:t>
       </w:r>
     </w:p>
     <w:p>
       <w:pPr>
         <w:pStyle w:val="ListBullet"/>
-        <w:spacing w:after="80"/>
+        <w:spacing w:after="120"/>
         <w:ind w:left="403"/>
       </w:pPr>
       <w:r>
         <w:rPr>
-          <w:color w:val="262B35"/>
-          <w:sz w:val="21"/>
+          <w:b/>
+          <w:color w:val="1A1A1A"/>
+          <w:sz w:val="20"/>
         </w:rPr>
-        <w:t>The bid lands 40% above the $134 billion completed February mark and $13 billion above the top of the previously reported $165 to 175 billion range; funds are not in hand, so the completed mark still anchors valuation work until the close (PitchBook financing note, August 7, 2026).</w:t>
+        <w:t xml:space="preserve">The bid resolves the July rumor upward. </w:t>
+      </w:r>
+      <w:r>
+        <w:rPr>
+          <w:color w:val="1A1A1A"/>
+          <w:sz w:val="20"/>
+        </w:rPr>
+        <w:t>It lands 40% above the $134 billion completed February mark and $13 billion above the top of the previously reported $165 to 175 billion range; until funds settle, the completed mark still anchors valuation work (PitchBook financing note, August 7, 2026).</w:t>
       </w:r>
     </w:p>
     <w:p>
       <w:pPr>
         <w:pStyle w:val="ListBullet"/>
-        <w:spacing w:after="80"/>
+        <w:spacing w:after="120"/>
         <w:ind w:left="403"/>
       </w:pPr>
       <w:r>
         <w:rPr>
-          <w:color w:val="262B35"/>
-          <w:sz w:val="21"/>
+          <w:b/>
+          <w:color w:val="1A1A1A"/>
+          <w:sz w:val="20"/>
         </w:rPr>
-        <w:t>The operating record did not move with the announcement: the last print remains $6.9 billion of annualized revenue growing +80% YoY, the fourth consecutive accelerating disclosure, with gross margin at 74% and guided lower (company disclosure, June 16, 2026).</w:t>
+        <w:t xml:space="preserve">The bid moved; the business did not. </w:t>
+      </w:r>
+      <w:r>
+        <w:rPr>
+          <w:color w:val="1A1A1A"/>
+          <w:sz w:val="20"/>
+        </w:rPr>
+        <w:t>The last print remains $6.9 billion of annualized revenue growing +80% YoY, the fourth consecutive accelerating disclosure, with gross margin at 74% and guided lower (company disclosure, June 16, 2026).</w:t>
       </w:r>
     </w:p>
     <w:p>
       <w:pPr>
         <w:pStyle w:val="ListBullet"/>
-        <w:spacing w:after="80"/>
+        <w:spacing w:after="120"/>
         <w:ind w:left="403"/>
       </w:pPr>
       <w:r>
         <w:rPr>
-          <w:color w:val="262B35"/>
-          <w:sz w:val="21"/>
+          <w:b/>
+          <w:color w:val="1A1A1A"/>
+          <w:sz w:val="20"/>
         </w:rPr>
-        <w:t>At $188 billion the run-rate multiple is 27.2x versus 19.4x at the completed mark, and the quality-adjusted price stays on the cohort floor at either level; the round close and the September to October disclosure window decide which number holds (derived).</w:t>
+        <w:t xml:space="preserve">Both marks stay on the cohort floor. </w:t>
+      </w:r>
+      <w:r>
+        <w:rPr>
+          <w:color w:val="1A1A1A"/>
+          <w:sz w:val="20"/>
+        </w:rPr>
+        <w:t>At $188 billion the run-rate multiple is 27.2x versus 19.4x at the completed mark, and the quality-adjusted price remains the cohort's cheapest at either level; the round close and the September to October disclosure window decide which number holds (derived).</w:t>
       </w:r>
     </w:p>
     <w:p>

</xml_diff>

<commit_message>
Institutional Research Style Guide encoded; PB chart look; em-dash budget
Files the style guide (style/) and binds its five rules across STYLE.md,
README, CLAUDE.md, and the vertical-note contract: punchline-first leads
carrying the metric (no rhetorical hooks), adjective eradication (QA
adjective-noise watchlist), rhythmic asymmetry, the so-what imperative, and
expanded throat-clearing bans (furthermore/robust/paradigm shift/it is
important to note). Em-dash policy moves from zero to sparing: WARN past 2
per block, FAIL past 8 per document. Chart factory gains the published
PitchBook look ('look': 'pb'): teal bars, inside-start value labels,
near-black title with grey unit subtitle, shaded zone bands, and the
Sources / Geography / As-of footer line. Proof note rebuilt: apex-compliant
takeaways + pb charts; QA clean.

Co-Authored-By: Claude Fable 5 <noreply@anthropic.com>
Claude-Session: https://claude.ai/code/session_01HodnyjbWZhifkSggmc88nP
</commit_message>
<xml_diff>
--- a/reports/databricks-vertical-note-2026-08-11/output/Q3_2026_Databricks_Vertical_Analyst_Note.docx
+++ b/reports/databricks-vertical-note-2026-08-11/output/Q3_2026_Databricks_Vertical_Analyst_Note.docx
@@ -415,14 +415,14 @@
           <w:color w:val="1A1A1A"/>
           <w:sz w:val="20"/>
         </w:rPr>
-        <w:t xml:space="preserve">Databricks signed at $188 billion, and the money is not in hand. </w:t>
+        <w:t xml:space="preserve">A signed term sheet prices Databricks at $188 billion post-money, 40% above the completed February mark and $13 billion above the top of the previously reported range. </w:t>
       </w:r>
       <w:r>
         <w:rPr>
           <w:color w:val="1A1A1A"/>
           <w:sz w:val="20"/>
         </w:rPr>
-        <w:t>The July 17 term sheet for a strategic round is led by existing investor Coatue; press reports place the size near $3 billion, and the company expects the close later this summer (company announcement, July 17, 2026).</w:t>
+        <w:t>Coatue leads with new and existing investors; press reports place the size near $3 billion, with the close expected later this summer. Until funds settle, the $134 billion completed mark anchors underwriting (company announcement, July 17, 2026).</w:t>
       </w:r>
     </w:p>
     <w:p>
@@ -437,14 +437,14 @@
           <w:color w:val="1A1A1A"/>
           <w:sz w:val="20"/>
         </w:rPr>
-        <w:t xml:space="preserve">The bid resolves the July rumor upward. </w:t>
+        <w:t xml:space="preserve">The bid re-prices the identical June operating print at 27.2x run-rate, from 19.4x at the completed mark. </w:t>
       </w:r>
       <w:r>
         <w:rPr>
           <w:color w:val="1A1A1A"/>
           <w:sz w:val="20"/>
         </w:rPr>
-        <w:t>It lands 40% above the $134 billion completed February mark and $13 billion above the top of the previously reported $165 to 175 billion range; until funds settle, the completed mark still anchors valuation work (PitchBook financing note, August 7, 2026).</w:t>
+        <w:t>No operating disclosure accompanied the announcement, so the September to October print decides which multiple the buyer actually paid (derived).</w:t>
       </w:r>
     </w:p>
     <w:p>
@@ -459,14 +459,14 @@
           <w:color w:val="1A1A1A"/>
           <w:sz w:val="20"/>
         </w:rPr>
-        <w:t xml:space="preserve">The bid moved; the business did not. </w:t>
+        <w:t xml:space="preserve">Run-rate has compounded from $4.0 billion to $6.9 billion in ten months, with growth accelerating from +50% to +80% YoY across four consecutive prints. </w:t>
       </w:r>
       <w:r>
         <w:rPr>
           <w:color w:val="1A1A1A"/>
           <w:sz w:val="20"/>
         </w:rPr>
-        <w:t>The last print remains $6.9 billion of annualized revenue growing +80% YoY, the fourth consecutive accelerating disclosure, with gross margin at 74% and guided lower (company disclosure, June 16, 2026).</w:t>
+        <w:t>Gross margin is the one line moving against the thesis: 74%, down from above 80% and guided lower, four points above the 70% efficiency floor that would force a quality re-score (company disclosure, June 16, 2026).</w:t>
       </w:r>
     </w:p>
     <w:p>
@@ -481,14 +481,14 @@
           <w:color w:val="1A1A1A"/>
           <w:sz w:val="20"/>
         </w:rPr>
-        <w:t xml:space="preserve">Both marks stay on the cohort floor. </w:t>
+        <w:t xml:space="preserve">At $15.2 billion per point of business quality on the completed mark, and roughly $21.3 billion on the announced bid (est.), Databricks remains the cohort's cheapest quality-adjusted asset by more than 5x. </w:t>
       </w:r>
       <w:r>
         <w:rPr>
           <w:color w:val="1A1A1A"/>
           <w:sz w:val="20"/>
         </w:rPr>
-        <w:t>At $188 billion the run-rate multiple is 27.2x versus 19.4x at the completed mark, and the quality-adjusted price remains the cohort's cheapest at either level; the round close and the September to October disclosure window decide which number holds (derived).</w:t>
+        <w:t>The nearest peer pays about $118 billion per point. Two dated catalysts govern the next quarter: the round close before the end of summer, and the September to October disclosure window (derived).</w:t>
       </w:r>
     </w:p>
     <w:p>
@@ -538,7 +538,7 @@
       <w:r>
         <w:drawing>
           <wp:inline xmlns:a="http://schemas.openxmlformats.org/drawingml/2006/main" xmlns:pic="http://schemas.openxmlformats.org/drawingml/2006/picture">
-            <wp:extent cx="5943600" cy="3114369"/>
+            <wp:extent cx="5943600" cy="3321847"/>
             <wp:docPr id="1" name="Picture 1"/>
             <wp:cNvGraphicFramePr>
               <a:graphicFrameLocks noChangeAspect="1"/>
@@ -559,7 +559,7 @@
                   <pic:spPr>
                     <a:xfrm>
                       <a:off x="0" y="0"/>
-                      <a:ext cx="5943600" cy="3114369"/>
+                      <a:ext cx="5943600" cy="3321847"/>
                     </a:xfrm>
                     <a:prstGeom prst="rect"/>
                   </pic:spPr>
@@ -632,7 +632,7 @@
       <w:r>
         <w:drawing>
           <wp:inline xmlns:a="http://schemas.openxmlformats.org/drawingml/2006/main" xmlns:pic="http://schemas.openxmlformats.org/drawingml/2006/picture">
-            <wp:extent cx="5943600" cy="2796477"/>
+            <wp:extent cx="5943600" cy="3033244"/>
             <wp:docPr id="2" name="Picture 2"/>
             <wp:cNvGraphicFramePr>
               <a:graphicFrameLocks noChangeAspect="1"/>
@@ -653,7 +653,7 @@
                   <pic:spPr>
                     <a:xfrm>
                       <a:off x="0" y="0"/>
-                      <a:ext cx="5943600" cy="2796477"/>
+                      <a:ext cx="5943600" cy="3033244"/>
                     </a:xfrm>
                     <a:prstGeom prst="rect"/>
                   </pic:spPr>
@@ -726,7 +726,7 @@
       <w:r>
         <w:drawing>
           <wp:inline xmlns:a="http://schemas.openxmlformats.org/drawingml/2006/main" xmlns:pic="http://schemas.openxmlformats.org/drawingml/2006/picture">
-            <wp:extent cx="5943600" cy="3417637"/>
+            <wp:extent cx="5943600" cy="3826819"/>
             <wp:docPr id="3" name="Picture 3"/>
             <wp:cNvGraphicFramePr>
               <a:graphicFrameLocks noChangeAspect="1"/>
@@ -747,7 +747,7 @@
                   <pic:spPr>
                     <a:xfrm>
                       <a:off x="0" y="0"/>
-                      <a:ext cx="5943600" cy="3417637"/>
+                      <a:ext cx="5943600" cy="3826819"/>
                     </a:xfrm>
                     <a:prstGeom prst="rect"/>
                   </pic:spPr>

</xml_diff>

<commit_message>
Voice blend + endnote citations
STYLE.md: the register is the desk blend, not a telegram: declarative spine,
mechanism sentences that walk one causal chain on 'because'/'so', a short
beat after, cadence limits both ways (max three straight under 10 words, max
two straight over 30), one dry observation per section. Citations move to
endnotes: [n] markers in block text render as superscript numbers tied to
the numbered References list (adjacent markers comma-separated); the build
fails on a marker without an entry and warns on uncited entries. The
unsourced-figure heuristic accepts endnote markers as source cues. Note
rewritten in the blend with all nine references wired; QA 0 FAIL / 0 WARN.

Co-Authored-By: Claude Fable 5 <noreply@anthropic.com>
Claude-Session: https://claude.ai/code/session_01HodnyjbWZhifkSggmc88nP
</commit_message>
<xml_diff>
--- a/reports/databricks-vertical-note-2026-08-11/output/Q3_2026_Databricks_Vertical_Analyst_Note.docx
+++ b/reports/databricks-vertical-note-2026-08-11/output/Q3_2026_Databricks_Vertical_Analyst_Note.docx
@@ -121,14 +121,6 @@
         <w:spacing w:after="40"/>
         <w:jc w:val="both"/>
       </w:pPr>
-      <w:r>
-        <w:rPr>
-          <w:b w:val="0"/>
-          <w:i w:val="0"/>
-          <w:color w:val="262B35"/>
-          <w:sz w:val="8"/>
-        </w:rPr>
-      </w:r>
     </w:p>
     <w:p>
       <w:pPr>
@@ -427,6 +419,7 @@
       <w:r>
         <w:rPr>
           <w:b/>
+          <w:i w:val="0"/>
           <w:color w:val="1A1A1A"/>
           <w:sz w:val="20"/>
         </w:rPr>
@@ -434,10 +427,39 @@
       </w:r>
       <w:r>
         <w:rPr>
+          <w:b w:val="0"/>
+          <w:i w:val="0"/>
           <w:color w:val="1A1A1A"/>
           <w:sz w:val="20"/>
         </w:rPr>
-        <w:t>Coatue leads the round. Press reports put the size near $3 billion. The company expects to close later this summer; until funds settle, the $134 billion February mark anchors the base case (company announcement, July 17, 2026).</w:t>
+        <w:t>Coatue leads, with new and existing investors behind it, and press reports put the size near $3 billion.</w:t>
+      </w:r>
+      <w:r>
+        <w:rPr>
+          <w:b w:val="0"/>
+          <w:color w:val="1A1A1A"/>
+          <w:sz w:val="20"/>
+          <w:vertAlign w:val="superscript"/>
+        </w:rPr>
+        <w:t>1</w:t>
+      </w:r>
+      <w:r>
+        <w:rPr>
+          <w:b w:val="0"/>
+          <w:color w:val="1A1A1A"/>
+          <w:sz w:val="20"/>
+          <w:vertAlign w:val="superscript"/>
+        </w:rPr>
+        <w:t>,3</w:t>
+      </w:r>
+      <w:r>
+        <w:rPr>
+          <w:b w:val="0"/>
+          <w:i w:val="0"/>
+          <w:color w:val="1A1A1A"/>
+          <w:sz w:val="20"/>
+        </w:rPr>
+        <w:t xml:space="preserve"> The close is expected later this summer; until funds settle, the $134 billion February mark anchors the base case.</w:t>
       </w:r>
     </w:p>
     <w:p>
@@ -449,6 +471,7 @@
       <w:r>
         <w:rPr>
           <w:b/>
+          <w:i w:val="0"/>
           <w:color w:val="1A1A1A"/>
           <w:sz w:val="20"/>
         </w:rPr>
@@ -456,10 +479,21 @@
       </w:r>
       <w:r>
         <w:rPr>
+          <w:b w:val="0"/>
+          <w:i w:val="0"/>
           <w:color w:val="1A1A1A"/>
           <w:sz w:val="20"/>
         </w:rPr>
-        <w:t>No operating number moved with the announcement. The September print decides which multiple the buyer paid (derived).</w:t>
+        <w:t>No operating number moved with the announcement, so the September print decides which multiple the buyer actually paid.</w:t>
+      </w:r>
+      <w:r>
+        <w:rPr>
+          <w:b w:val="0"/>
+          <w:color w:val="1A1A1A"/>
+          <w:sz w:val="20"/>
+          <w:vertAlign w:val="superscript"/>
+        </w:rPr>
+        <w:t>7</w:t>
       </w:r>
     </w:p>
     <w:p>
@@ -471,6 +505,7 @@
       <w:r>
         <w:rPr>
           <w:b/>
+          <w:i w:val="0"/>
           <w:color w:val="1A1A1A"/>
           <w:sz w:val="20"/>
         </w:rPr>
@@ -478,10 +513,21 @@
       </w:r>
       <w:r>
         <w:rPr>
+          <w:b w:val="0"/>
+          <w:i w:val="0"/>
           <w:color w:val="1A1A1A"/>
           <w:sz w:val="20"/>
         </w:rPr>
-        <w:t>The counterweight is gross margin, at 74% and guided lower. The floor is 70%. Below it, the quality score gets rebuilt no matter what the round does (company disclosure, June 16, 2026).</w:t>
+        <w:t>The counterweight is gross margin at 74%, guided lower, four points above the 70% floor that forces a quality re-score no matter what the round does.</w:t>
+      </w:r>
+      <w:r>
+        <w:rPr>
+          <w:b w:val="0"/>
+          <w:color w:val="1A1A1A"/>
+          <w:sz w:val="20"/>
+          <w:vertAlign w:val="superscript"/>
+        </w:rPr>
+        <w:t>7</w:t>
       </w:r>
     </w:p>
     <w:p>
@@ -493,17 +539,29 @@
       <w:r>
         <w:rPr>
           <w:b/>
+          <w:i w:val="0"/>
           <w:color w:val="1A1A1A"/>
           <w:sz w:val="20"/>
         </w:rPr>
-        <w:t xml:space="preserve">At either mark, Databricks is the cheapest quality-adjusted asset in the cohort: $15.2 billion per point completed, about $21.3 billion announced (est.). </w:t>
+        <w:t xml:space="preserve">At either mark, Databricks is the cheapest quality-adjusted asset in the cohort: $15.2 billion per point of business quality completed, about $21.3 billion announced (est.). </w:t>
       </w:r>
       <w:r>
         <w:rPr>
+          <w:b w:val="0"/>
+          <w:i w:val="0"/>
           <w:color w:val="1A1A1A"/>
           <w:sz w:val="20"/>
         </w:rPr>
-        <w:t>The nearest peer pays about $118 billion per point. We assess a close by October 31 as very likely (80-95%). Confidence: moderate; the size and terms are press-sourced (derived).</w:t>
+        <w:t>The nearest peer pays about $118 billion per point. We assess a close by October 31 as very likely (80-95%). Confidence: moderate; the size and terms are press-sourced.</w:t>
+      </w:r>
+      <w:r>
+        <w:rPr>
+          <w:b w:val="0"/>
+          <w:color w:val="1A1A1A"/>
+          <w:sz w:val="20"/>
+          <w:vertAlign w:val="superscript"/>
+        </w:rPr>
+        <w:t>3</w:t>
       </w:r>
     </w:p>
     <w:p>
@@ -526,7 +584,70 @@
           <w:color w:val="262B35"/>
           <w:sz w:val="21"/>
         </w:rPr>
-        <w:t>Databricks signed a term sheet on July 17. The round values the company at $188 billion post-money, with Coatue in the lead and new and existing investors behind it (company announcement, July 17, 2026). The company has not disclosed the size. Press reports put it near $3 billion. The close is expected later this summer, and until it lands the money is not in hand; PitchBook carries the round as announced and in progress, the thirteenth (financing note, August 7, 2026).</w:t>
+        <w:t>Databricks signed a term sheet on July 17 for a strategic round at $188 billion post-money, led by Coatue with new and existing investors behind it.</w:t>
+      </w:r>
+      <w:r>
+        <w:rPr>
+          <w:b w:val="0"/>
+          <w:color w:val="262B35"/>
+          <w:sz w:val="21"/>
+          <w:vertAlign w:val="superscript"/>
+        </w:rPr>
+        <w:t>1</w:t>
+      </w:r>
+      <w:r>
+        <w:rPr>
+          <w:b w:val="0"/>
+          <w:i w:val="0"/>
+          <w:color w:val="262B35"/>
+          <w:sz w:val="21"/>
+        </w:rPr>
+        <w:t xml:space="preserve"> The company has not said how much it is raising; press reports put the figure near $3 billion.</w:t>
+      </w:r>
+      <w:r>
+        <w:rPr>
+          <w:b w:val="0"/>
+          <w:color w:val="262B35"/>
+          <w:sz w:val="21"/>
+          <w:vertAlign w:val="superscript"/>
+        </w:rPr>
+        <w:t>3</w:t>
+      </w:r>
+      <w:r>
+        <w:rPr>
+          <w:b w:val="0"/>
+          <w:i w:val="0"/>
+          <w:color w:val="262B35"/>
+          <w:sz w:val="21"/>
+        </w:rPr>
+        <w:t xml:space="preserve"> The money is not in hand yet, and the company says so itself, with the close expected later this summer.</w:t>
+      </w:r>
+      <w:r>
+        <w:rPr>
+          <w:b w:val="0"/>
+          <w:color w:val="262B35"/>
+          <w:sz w:val="21"/>
+          <w:vertAlign w:val="superscript"/>
+        </w:rPr>
+        <w:t>2</w:t>
+      </w:r>
+      <w:r>
+        <w:rPr>
+          <w:b w:val="0"/>
+          <w:i w:val="0"/>
+          <w:color w:val="262B35"/>
+          <w:sz w:val="21"/>
+        </w:rPr>
+        <w:t xml:space="preserve"> PitchBook carries the round as announced and in progress, the thirteenth.</w:t>
+      </w:r>
+      <w:r>
+        <w:rPr>
+          <w:b w:val="0"/>
+          <w:color w:val="262B35"/>
+          <w:sz w:val="21"/>
+          <w:vertAlign w:val="superscript"/>
+        </w:rPr>
+        <w:t>5</w:t>
       </w:r>
     </w:p>
     <w:p>
@@ -541,7 +662,34 @@
           <w:color w:val="262B35"/>
           <w:sz w:val="21"/>
         </w:rPr>
-        <w:t>The last completed mark was $134 billion, set in February. The new bid sits 40% above it. It also sits $13 billion above the top of the range the press reported in June, $165 billion to $175 billion. Rumored rounds usually shrink on contact with a term sheet. This one grew.</w:t>
+        <w:t>The last completed mark was $134 billion, set in February.</w:t>
+      </w:r>
+      <w:r>
+        <w:rPr>
+          <w:b w:val="0"/>
+          <w:color w:val="262B35"/>
+          <w:sz w:val="21"/>
+          <w:vertAlign w:val="superscript"/>
+        </w:rPr>
+        <w:t>6</w:t>
+      </w:r>
+      <w:r>
+        <w:rPr>
+          <w:b w:val="0"/>
+          <w:i w:val="0"/>
+          <w:color w:val="262B35"/>
+          <w:sz w:val="21"/>
+        </w:rPr>
+        <w:t xml:space="preserve"> The new bid sits 40% above it, and $13 billion above the top of the $165 billion to $175 billion range the press floated in June. Rumored rounds usually shrink on contact with a term sheet; this one grew, which tells you where the demand sat. Against the cohort the step is almost modest: the same five months took the nearest frontier peer from $380 billion to $965 billion.</w:t>
+      </w:r>
+      <w:r>
+        <w:rPr>
+          <w:b w:val="0"/>
+          <w:color w:val="262B35"/>
+          <w:sz w:val="21"/>
+          <w:vertAlign w:val="superscript"/>
+        </w:rPr>
+        <w:t>4</w:t>
       </w:r>
     </w:p>
     <w:p>
@@ -556,7 +704,43 @@
           <w:color w:val="262B35"/>
           <w:sz w:val="21"/>
         </w:rPr>
-        <w:t>The size is the tell. Three billion dollars is less than half of February's $7.0 billion round, and the business generates cash on its own (company, February 9, 2026). A company that raises small at a 40% markup is not funding operations. It is marking itself up and adding dry powder, on its own schedule. The stated use is AI product: Genie, Unity AI Gateway, Lakebase (company announcement via press reports, July 17, 2026). House rule regardless: an unclosed round never anchors the base case. The $134 billion mark holds until funds settle.</w:t>
+        <w:t>The size is the tell. Three billion dollars is less than half of February's $7.0 billion round, raised by a business that already funds itself.</w:t>
+      </w:r>
+      <w:r>
+        <w:rPr>
+          <w:b w:val="0"/>
+          <w:color w:val="262B35"/>
+          <w:sz w:val="21"/>
+          <w:vertAlign w:val="superscript"/>
+        </w:rPr>
+        <w:t>6</w:t>
+      </w:r>
+      <w:r>
+        <w:rPr>
+          <w:b w:val="0"/>
+          <w:i w:val="0"/>
+          <w:color w:val="262B35"/>
+          <w:sz w:val="21"/>
+        </w:rPr>
+        <w:t xml:space="preserve"> A company that raises small at a 40% markup is not plugging a hole; it is marking itself up and stacking dry powder on its own schedule, with the stated use pointed at AI product: Genie, Unity AI Gateway, Lakebase.</w:t>
+      </w:r>
+      <w:r>
+        <w:rPr>
+          <w:b w:val="0"/>
+          <w:color w:val="262B35"/>
+          <w:sz w:val="21"/>
+          <w:vertAlign w:val="superscript"/>
+        </w:rPr>
+        <w:t>1</w:t>
+      </w:r>
+      <w:r>
+        <w:rPr>
+          <w:b w:val="0"/>
+          <w:i w:val="0"/>
+          <w:color w:val="262B35"/>
+          <w:sz w:val="21"/>
+        </w:rPr>
+        <w:t xml:space="preserve"> The house rule holds regardless. An unclosed round never anchors the base case, so $134 billion stays the working mark until funds settle.</w:t>
       </w:r>
     </w:p>
     <w:p>
@@ -635,7 +819,25 @@
           <w:color w:val="262B35"/>
           <w:sz w:val="21"/>
         </w:rPr>
-        <w:t>Nothing in the operating record moved with the announcement. The last print stands at $6.9 billion of annualized revenue, up 80% year over year (company disclosure, June 16, 2026). It was the fourth straight print to accelerate: $4.0 billion, $4.8 billion, $5.4 billion, $6.9 billion in ten months. Software companies at this scale slow down. This one sped up.</w:t>
+        <w:t>Nothing in the operating record moved with the announcement, and that is the point: the bid re-rates an engine that was already accelerating. The last print stands at $6.9 billion of annualized revenue, up 80% year over year, the fourth straight disclosure to accelerate.</w:t>
+      </w:r>
+      <w:r>
+        <w:rPr>
+          <w:b w:val="0"/>
+          <w:color w:val="262B35"/>
+          <w:sz w:val="21"/>
+          <w:vertAlign w:val="superscript"/>
+        </w:rPr>
+        <w:t>7</w:t>
+      </w:r>
+      <w:r>
+        <w:rPr>
+          <w:b w:val="0"/>
+          <w:i w:val="0"/>
+          <w:color w:val="262B35"/>
+          <w:sz w:val="21"/>
+        </w:rPr>
+        <w:t xml:space="preserve"> The ladder reads $4.0 billion, $4.8 billion, $5.4 billion, $6.9 billion in ten months. Software companies at this scale are supposed to slow down. This one sped up.</w:t>
       </w:r>
     </w:p>
     <w:p>
@@ -650,7 +852,25 @@
           <w:color w:val="262B35"/>
           <w:sz w:val="21"/>
         </w:rPr>
-        <w:t>The counterweight is gross margin. It stands at 74%, down from above 80%, and management guides it lower; agents fire queries at machine speed, and the compute bill lands in cost of revenue (company disclosure, June 16, 2026). The floor that matters is 70%. Break it and the quality score gets rebuilt, whatever the round does. The cushion is four points.</w:t>
+        <w:t>The counterweight is gross margin, and it is the number to watch. Margin stands at 74%, down from above 80%, and management guides it lower because agents fire queries at machine speed and the compute bill lands in cost of revenue.</w:t>
+      </w:r>
+      <w:r>
+        <w:rPr>
+          <w:b w:val="0"/>
+          <w:color w:val="262B35"/>
+          <w:sz w:val="21"/>
+          <w:vertAlign w:val="superscript"/>
+        </w:rPr>
+        <w:t>7</w:t>
+      </w:r>
+      <w:r>
+        <w:rPr>
+          <w:b w:val="0"/>
+          <w:i w:val="0"/>
+          <w:color w:val="262B35"/>
+          <w:sz w:val="21"/>
+        </w:rPr>
+        <w:t xml:space="preserve"> The floor that matters is 70%: break it and the quality score gets rebuilt, whatever the round does. The cushion is four points.</w:t>
       </w:r>
     </w:p>
     <w:p>
@@ -665,7 +885,43 @@
           <w:color w:val="262B35"/>
           <w:sz w:val="21"/>
         </w:rPr>
-        <w:t>The rest of the record is firm but dated. Free cash flow was positive on trailing and fiscal 2025 bases at the February disclosure. Retention ran above 140%, across more than 20,000 organizations; both figures are February vintage and past their refresh window. Headcount stands at 9,000 (PitchBook, June 9, 2026). The September to October window is the scheduled refresh. Until then, the old numbers carry their dates.</w:t>
+        <w:t>The rest of the record is firm but dated. Free cash flow was positive on trailing and fiscal 2025 bases at the February disclosure, retention ran above 140%, and the platform served more than 20,000 organizations; all of it is February vintage and past its refresh window.</w:t>
+      </w:r>
+      <w:r>
+        <w:rPr>
+          <w:b w:val="0"/>
+          <w:color w:val="262B35"/>
+          <w:sz w:val="21"/>
+          <w:vertAlign w:val="superscript"/>
+        </w:rPr>
+        <w:t>6</w:t>
+      </w:r>
+      <w:r>
+        <w:rPr>
+          <w:b w:val="0"/>
+          <w:i w:val="0"/>
+          <w:color w:val="262B35"/>
+          <w:sz w:val="21"/>
+        </w:rPr>
+        <w:t xml:space="preserve"> Headcount stands at 9,000.</w:t>
+      </w:r>
+      <w:r>
+        <w:rPr>
+          <w:b w:val="0"/>
+          <w:color w:val="262B35"/>
+          <w:sz w:val="21"/>
+          <w:vertAlign w:val="superscript"/>
+        </w:rPr>
+        <w:t>5</w:t>
+      </w:r>
+      <w:r>
+        <w:rPr>
+          <w:b w:val="0"/>
+          <w:i w:val="0"/>
+          <w:color w:val="262B35"/>
+          <w:sz w:val="21"/>
+        </w:rPr>
+        <w:t xml:space="preserve"> The September to October window is the scheduled refresh, and until it prints, the old numbers carry their dates.</w:t>
       </w:r>
     </w:p>
     <w:p>
@@ -744,7 +1000,25 @@
           <w:color w:val="262B35"/>
           <w:sz w:val="21"/>
         </w:rPr>
-        <w:t>The bid re-prices the same June print. At $134 billion the multiple is 19.4x run-rate; at $188 billion it is 27.2x (derived). Growth adjustment keeps both defensible. At 27.2x against 80% growth, each point of growth costs 0.34x. The closest listed comparable trades at 15.3x its guided 31% forward growth, or 0.49x per point (comparable company 8-K, May 27, 2026; derived). The buyer at the higher private price still pays less per unit of growth than the public market pays for the slower asset.</w:t>
+        <w:t>The bid re-prices the same June print, so the multiple math is clean: 19.4x run-rate at $134 billion, 27.2x at $188 billion. Growth adjustment keeps both defensible. At 27.2x against 80% growth, a point of growth costs 0.34x; the closest listed comparable trades at 15.3x its guided 31%, or 0.49x per point.</w:t>
+      </w:r>
+      <w:r>
+        <w:rPr>
+          <w:b w:val="0"/>
+          <w:color w:val="262B35"/>
+          <w:sz w:val="21"/>
+          <w:vertAlign w:val="superscript"/>
+        </w:rPr>
+        <w:t>9</w:t>
+      </w:r>
+      <w:r>
+        <w:rPr>
+          <w:b w:val="0"/>
+          <w:i w:val="0"/>
+          <w:color w:val="262B35"/>
+          <w:sz w:val="21"/>
+        </w:rPr>
+        <w:t xml:space="preserve"> The buyer at the higher private price still pays less per unit of growth than the public market pays for the slower asset.</w:t>
       </w:r>
     </w:p>
     <w:p>
@@ -759,7 +1033,7 @@
           <w:color w:val="262B35"/>
           <w:sz w:val="21"/>
         </w:rPr>
-        <w:t>The quality math holds too. The completed mark prices business quality at $15.2 billion per point on the desk's framework. The announced bid prices it near $21.3 billion (est.). The nearest peer pays about $118 billion per point, the top of the cohort near $188 billion, and the listed parent's implied AI segment about $279 billion (est., derived). At either mark, Databricks is the cohort floor by more than 5x.</w:t>
+        <w:t>The quality math holds as well. On the desk's framework the completed mark prices business quality at $15.2 billion per point, and the announced bid prices it near $21.3 billion (est.). The nearest peer pays about $118 billion, the top of the cohort near $188 billion, and the listed parent's implied AI segment about $279 billion (est.). At either mark Databricks is the cohort floor by more than 5x, and that spread, not the round, is the durable fact.</w:t>
       </w:r>
     </w:p>
     <w:p>
@@ -774,7 +1048,34 @@
           <w:color w:val="262B35"/>
           <w:sz w:val="21"/>
         </w:rPr>
-        <w:t>Two dates decide the next quarter. First, the close: the company says later this summer, and we assess completion by October 31 as very likely (80-95%). Confidence: moderate; the size and terms are press-sourced and the company has not disclosed them. Second, the print: September to October, testing the run-rate against $6.9 billion, the margin against 70%, and the February metrics against fresh ones. The kill criterion is written. A gross-margin print below 70% by the October disclosure forces a quality re-score, round or no round. The registry stays quiet; no S-1 was on file at the last check (SEC EDGAR, July 10, 2026).</w:t>
+        <w:t>Two dates decide the next quarter. First, the close: the company says later this summer, and we assess completion by October 31 as very likely (80-95%). Confidence: moderate; the size and terms are press-sourced and the company has not disclosed them.</w:t>
+      </w:r>
+      <w:r>
+        <w:rPr>
+          <w:b w:val="0"/>
+          <w:color w:val="262B35"/>
+          <w:sz w:val="21"/>
+          <w:vertAlign w:val="superscript"/>
+        </w:rPr>
+        <w:t>3</w:t>
+      </w:r>
+      <w:r>
+        <w:rPr>
+          <w:b w:val="0"/>
+          <w:i w:val="0"/>
+          <w:color w:val="262B35"/>
+          <w:sz w:val="21"/>
+        </w:rPr>
+        <w:t xml:space="preserve"> Second, the print: September to October, testing the run-rate against $6.9 billion, the margin against 70%, and the February metrics against fresh ones. The kill criterion is written. A gross-margin print below 70% by the October disclosure forces a quality re-score, round or no round. The registry stays quiet; no S-1 was on file at the last check.</w:t>
+      </w:r>
+      <w:r>
+        <w:rPr>
+          <w:b w:val="0"/>
+          <w:color w:val="262B35"/>
+          <w:sz w:val="21"/>
+          <w:vertAlign w:val="superscript"/>
+        </w:rPr>
+        <w:t>8</w:t>
       </w:r>
     </w:p>
     <w:p>
@@ -1508,6 +1809,24 @@
         <w:t>https://data.sec.gov/submissions/CIK0001587468.json</w:t>
       </w:r>
     </w:p>
+    <w:p>
+      <w:pPr>
+        <w:spacing w:after="60"/>
+      </w:pPr>
+      <w:r>
+        <w:rPr>
+          <w:b/>
+          <w:sz w:val="18"/>
+        </w:rPr>
+        <w:t xml:space="preserve">9. </w:t>
+      </w:r>
+      <w:r>
+        <w:rPr>
+          <w:sz w:val="18"/>
+        </w:rPr>
+        <w:t>Snowflake 8-K, Q1 FY2027 results and FY2027 product revenue guidance ($5.84B, +31%), May 27, 2026.</w:t>
+      </w:r>
+    </w:p>
     <w:sectPr>
       <w:pgSz w:w="12240" w:h="15840"/>
       <w:pgMar w:top="1440" w:right="1440" w:bottom="1440" w:left="1440" w:header="720" w:footer="720" w:gutter="0"/>

</xml_diff>

<commit_message>
Storytelling flow doctrine + zero-defect grammar gate
STYLE.md gains 'The story' (one narrative spine per note stated in the
subtitle; sections close by raising the question the next answers; each
section earns one second-level insight with its evidence beside it; the
verdict resolves the story it opened) and 'Grammar is absolute' (named traps:
ambiguous antecedents, sentential 'which', bare-noun openings, danglers,
elliptical drops, false parallels). Pipeline stage 7 now opens with the
content-qa audit; every ERROR is fixed, never waived. Note rewritten with
the narrative spine and section handoffs, then audited: 7 findings caught
and fixed (ambiguous 'measured', engine-that-reports antecedent, two
comma-because constructions, slippery 'until it prints', mixed metaphor on
the cohort floor, an 18-word takeaway/body repeat). Rebuilt clean.

Co-Authored-By: Claude Fable 5 <noreply@anthropic.com>
Claude-Session: https://claude.ai/code/session_01HodnyjbWZhifkSggmc88nP
</commit_message>
<xml_diff>
--- a/reports/databricks-vertical-note-2026-08-11/output/Q3_2026_Databricks_Vertical_Analyst_Note.docx
+++ b/reports/databricks-vertical-note-2026-08-11/output/Q3_2026_Databricks_Vertical_Analyst_Note.docx
@@ -432,7 +432,7 @@
           <w:color w:val="1A1A1A"/>
           <w:sz w:val="20"/>
         </w:rPr>
-        <w:t>Coatue leads, with new and existing investors behind it, and press reports put the size near $3 billion.</w:t>
+        <w:t>Coatue leads the round, joined by new and existing investors, and press reports put the size near $3 billion.</w:t>
       </w:r>
       <w:r>
         <w:rPr>
@@ -459,7 +459,7 @@
           <w:color w:val="1A1A1A"/>
           <w:sz w:val="20"/>
         </w:rPr>
-        <w:t xml:space="preserve"> The close is expected later this summer; until funds settle, the $134 billion February mark anchors the base case.</w:t>
+        <w:t xml:space="preserve"> The company expects to close later this summer; until funds settle, the $134 billion February mark anchors the base case.</w:t>
       </w:r>
     </w:p>
     <w:p>
@@ -475,7 +475,7 @@
           <w:color w:val="1A1A1A"/>
           <w:sz w:val="20"/>
         </w:rPr>
-        <w:t xml:space="preserve">The same $6.9 billion run-rate now carries two prices: 19.4x at the completed mark, 27.2x at the announced one. </w:t>
+        <w:t xml:space="preserve">The same $6.9 billion run-rate now carries two prices: 19.4x at the completed mark and 27.2x at the announced one. </w:t>
       </w:r>
       <w:r>
         <w:rPr>
@@ -484,7 +484,7 @@
           <w:color w:val="1A1A1A"/>
           <w:sz w:val="20"/>
         </w:rPr>
-        <w:t>No operating number moved with the announcement, so the September print decides which multiple the buyer actually paid.</w:t>
+        <w:t>No operating figure moved with the announcement, so the September print will decide which multiple the buyer actually paid.</w:t>
       </w:r>
       <w:r>
         <w:rPr>
@@ -509,7 +509,7 @@
           <w:color w:val="1A1A1A"/>
           <w:sz w:val="20"/>
         </w:rPr>
-        <w:t xml:space="preserve">Revenue is accelerating through $7 billion: four straight prints, +50% to +80% YoY. </w:t>
+        <w:t xml:space="preserve">Revenue is accelerating through $7 billion, with growth climbing across four straight prints from +50% to +80% YoY. </w:t>
       </w:r>
       <w:r>
         <w:rPr>
@@ -518,7 +518,7 @@
           <w:color w:val="1A1A1A"/>
           <w:sz w:val="20"/>
         </w:rPr>
-        <w:t>The counterweight is gross margin at 74%, guided lower, four points above the 70% floor that forces a quality re-score no matter what the round does.</w:t>
+        <w:t>Gross margin is the counterweight: 74%, guided lower, and four points above the 70% floor that would force a quality re-score regardless of the round.</w:t>
       </w:r>
       <w:r>
         <w:rPr>
@@ -543,7 +543,7 @@
           <w:color w:val="1A1A1A"/>
           <w:sz w:val="20"/>
         </w:rPr>
-        <w:t xml:space="preserve">At either mark, Databricks is the cheapest quality-adjusted asset in the cohort: $15.2 billion per point of business quality completed, about $21.3 billion announced (est.). </w:t>
+        <w:t xml:space="preserve">At either mark, Databricks remains the cohort's cheapest quality-adjusted asset: $15.2 billion per point of business quality at the completed mark, roughly $21.3 billion at the announced one (est.). </w:t>
       </w:r>
       <w:r>
         <w:rPr>
@@ -552,7 +552,7 @@
           <w:color w:val="1A1A1A"/>
           <w:sz w:val="20"/>
         </w:rPr>
-        <w:t>The nearest peer pays about $118 billion per point. We assess a close by October 31 as very likely (80-95%). Confidence: moderate; the size and terms are press-sourced.</w:t>
+        <w:t>The nearest peer pays about $118 billion per point. We assess a close by October 31 as very likely (80-95%). Confidence: moderate; the size and terms remain press-sourced.</w:t>
       </w:r>
       <w:r>
         <w:rPr>
@@ -584,7 +584,7 @@
           <w:color w:val="262B35"/>
           <w:sz w:val="21"/>
         </w:rPr>
-        <w:t>Databricks signed a term sheet on July 17 for a strategic round at $188 billion post-money, led by Coatue with new and existing investors behind it.</w:t>
+        <w:t>The round spent June as a rumor and July as a fact. On July 17, Databricks signed a term sheet for a strategic round at $188 billion post-money, led by Coatue and joined by new and existing investors.</w:t>
       </w:r>
       <w:r>
         <w:rPr>
@@ -620,7 +620,7 @@
           <w:color w:val="262B35"/>
           <w:sz w:val="21"/>
         </w:rPr>
-        <w:t xml:space="preserve"> The money is not in hand yet, and the company says so itself, with the close expected later this summer.</w:t>
+        <w:t xml:space="preserve"> Nor is the money in hand. The close is expected later this summer, and PitchBook carries the round as announced and in progress, the thirteenth in the company's history.</w:t>
       </w:r>
       <w:r>
         <w:rPr>
@@ -634,20 +634,11 @@
       <w:r>
         <w:rPr>
           <w:b w:val="0"/>
-          <w:i w:val="0"/>
-          <w:color w:val="262B35"/>
-          <w:sz w:val="21"/>
-        </w:rPr>
-        <w:t xml:space="preserve"> PitchBook carries the round as announced and in progress, the thirteenth.</w:t>
-      </w:r>
-      <w:r>
-        <w:rPr>
-          <w:b w:val="0"/>
           <w:color w:val="262B35"/>
           <w:sz w:val="21"/>
           <w:vertAlign w:val="superscript"/>
         </w:rPr>
-        <w:t>5</w:t>
+        <w:t>,5</w:t>
       </w:r>
     </w:p>
     <w:p>
@@ -662,7 +653,7 @@
           <w:color w:val="262B35"/>
           <w:sz w:val="21"/>
         </w:rPr>
-        <w:t>The last completed mark was $134 billion, set in February.</w:t>
+        <w:t>The price carries the first insight. February's completed mark was $134 billion; the term sheet lands 40% above it, and $13 billion above the top of the $165 billion to $175 billion range that circulated in June.</w:t>
       </w:r>
       <w:r>
         <w:rPr>
@@ -680,7 +671,7 @@
           <w:color w:val="262B35"/>
           <w:sz w:val="21"/>
         </w:rPr>
-        <w:t xml:space="preserve"> The new bid sits 40% above it, and $13 billion above the top of the $165 billion to $175 billion range the press floated in June. Rumored rounds usually shrink on contact with a term sheet; this one grew, which tells you where the demand sat. Against the cohort the step is almost modest: the same five months took the nearest frontier peer from $380 billion to $965 billion.</w:t>
+        <w:t xml:space="preserve"> Rumored rounds tend to shrink on contact with a term sheet, because talks leak at their most hopeful number. This one grew, and the growth is the clearest available reading of demand. Even so, the step is restrained by cohort standards: over the same five months, the nearest frontier peer moved from $380 billion to $965 billion.</w:t>
       </w:r>
       <w:r>
         <w:rPr>
@@ -704,7 +695,7 @@
           <w:color w:val="262B35"/>
           <w:sz w:val="21"/>
         </w:rPr>
-        <w:t>The size is the tell. Three billion dollars is less than half of February's $7.0 billion round, raised by a business that already funds itself.</w:t>
+        <w:t>The size carries the second. Three billion dollars is less than half of February's $7.0 billion raise, and it is being sought by a business that already funds itself from operations.</w:t>
       </w:r>
       <w:r>
         <w:rPr>
@@ -722,7 +713,7 @@
           <w:color w:val="262B35"/>
           <w:sz w:val="21"/>
         </w:rPr>
-        <w:t xml:space="preserve"> A company that raises small at a 40% markup is not plugging a hole; it is marking itself up and stacking dry powder on its own schedule, with the stated use pointed at AI product: Genie, Unity AI Gateway, Lakebase.</w:t>
+        <w:t xml:space="preserve"> A company that raises small at a 40% markup is not covering a shortfall; it is setting a higher price on itself and adding reserves, on its own schedule, with the proceeds pointed at AI products: Genie, Unity AI Gateway, and Lakebase.</w:t>
       </w:r>
       <w:r>
         <w:rPr>
@@ -740,7 +731,7 @@
           <w:color w:val="262B35"/>
           <w:sz w:val="21"/>
         </w:rPr>
-        <w:t xml:space="preserve"> The house rule holds regardless. An unclosed round never anchors the base case, so $134 billion stays the working mark until funds settle.</w:t>
+        <w:t xml:space="preserve"> None of this moves the base case. An unclosed round never anchors valuation under the house rule, so $134 billion remains the working mark until funds settle. Whether the higher price is earned is a question for the operating record, and the record has an answer.</w:t>
       </w:r>
     </w:p>
     <w:p>
@@ -819,7 +810,7 @@
           <w:color w:val="262B35"/>
           <w:sz w:val="21"/>
         </w:rPr>
-        <w:t>Nothing in the operating record moved with the announcement, and that is the point: the bid re-rates an engine that was already accelerating. The last print stands at $6.9 billion of annualized revenue, up 80% year over year, the fourth straight disclosure to accelerate.</w:t>
+        <w:t>The record's answer is acceleration. Nothing operational moved with the announcement; the bid re-rates an engine that has grown faster with every report. The latest print stands at $6.9 billion of annualized revenue, up 80% year over year, the fourth consecutive print in which growth accelerated.</w:t>
       </w:r>
       <w:r>
         <w:rPr>
@@ -837,7 +828,7 @@
           <w:color w:val="262B35"/>
           <w:sz w:val="21"/>
         </w:rPr>
-        <w:t xml:space="preserve"> The ladder reads $4.0 billion, $4.8 billion, $5.4 billion, $6.9 billion in ten months. Software companies at this scale are supposed to slow down. This one sped up.</w:t>
+        <w:t xml:space="preserve"> The ladder reads $4.0 billion, $4.8 billion, $5.4 billion, and $6.9 billion across ten months. Software companies at this scale are supposed to slow down. This one has been speeding up.</w:t>
       </w:r>
     </w:p>
     <w:p>
@@ -852,7 +843,7 @@
           <w:color w:val="262B35"/>
           <w:sz w:val="21"/>
         </w:rPr>
-        <w:t>The counterweight is gross margin, and it is the number to watch. Margin stands at 74%, down from above 80%, and management guides it lower because agents fire queries at machine speed and the compute bill lands in cost of revenue.</w:t>
+        <w:t>Gross margin is the counterweight, and it is the number to watch. The margin stands at 74%, down from above 80%, and management guides it lower for a structural reason: agents fire queries at machine speed, and the compute bill lands in cost of revenue.</w:t>
       </w:r>
       <w:r>
         <w:rPr>
@@ -870,7 +861,7 @@
           <w:color w:val="262B35"/>
           <w:sz w:val="21"/>
         </w:rPr>
-        <w:t xml:space="preserve"> The floor that matters is 70%: break it and the quality score gets rebuilt, whatever the round does. The cushion is four points.</w:t>
+        <w:t xml:space="preserve"> That trade sits at the heart of the story because the fastest-growing revenue arrives with its own rising cost attached. The floor that matters is 70%. Break it, and the quality score gets rebuilt regardless of what the round does. The cushion today is four points.</w:t>
       </w:r>
     </w:p>
     <w:p>
@@ -885,7 +876,7 @@
           <w:color w:val="262B35"/>
           <w:sz w:val="21"/>
         </w:rPr>
-        <w:t>The rest of the record is firm but dated. Free cash flow was positive on trailing and fiscal 2025 bases at the February disclosure, retention ran above 140%, and the platform served more than 20,000 organizations; all of it is February vintage and past its refresh window.</w:t>
+        <w:t>The rest of the record is firm but dated. At the February disclosure, free cash flow was positive on both trailing and fiscal-2025 bases, retention ran above 140%, and the platform served more than 20,000 organizations; each of those figures is now past its refresh window.</w:t>
       </w:r>
       <w:r>
         <w:rPr>
@@ -921,7 +912,7 @@
           <w:color w:val="262B35"/>
           <w:sz w:val="21"/>
         </w:rPr>
-        <w:t xml:space="preserve"> The September to October window is the scheduled refresh, and until it prints, the old numbers carry their dates.</w:t>
+        <w:t xml:space="preserve"> The September-to-October window is the scheduled refresh; until then, the old numbers carry their dates. What can be priced today is the current part of the record: the growth, the margin, and the gap between the two marks.</w:t>
       </w:r>
     </w:p>
     <w:p>
@@ -1000,7 +991,7 @@
           <w:color w:val="262B35"/>
           <w:sz w:val="21"/>
         </w:rPr>
-        <w:t>The bid re-prices the same June print, so the multiple math is clean: 19.4x run-rate at $134 billion, 27.2x at $188 billion. Growth adjustment keeps both defensible. At 27.2x against 80% growth, a point of growth costs 0.34x; the closest listed comparable trades at 15.3x its guided 31%, or 0.49x per point.</w:t>
+        <w:t>Pricing that record is straightforward because the bid re-prices the same June print. At $134 billion, the multiple is 19.4x run-rate; at $188 billion, it is 27.2x. Growth adjustment keeps both defensible. At 27.2x against 80% growth, a point of growth costs 0.34x, while the closest listed comparable trades at 15.3x against guided growth of 31%, or 0.49x per point.</w:t>
       </w:r>
       <w:r>
         <w:rPr>
@@ -1033,7 +1024,7 @@
           <w:color w:val="262B35"/>
           <w:sz w:val="21"/>
         </w:rPr>
-        <w:t>The quality math holds as well. On the desk's framework the completed mark prices business quality at $15.2 billion per point, and the announced bid prices it near $21.3 billion (est.). The nearest peer pays about $118 billion, the top of the cohort near $188 billion, and the listed parent's implied AI segment about $279 billion (est.). At either mark Databricks is the cohort floor by more than 5x, and that spread, not the round, is the durable fact.</w:t>
+        <w:t>The quality lens tells the same story from a different angle. On the desk's framework, the completed mark prices business quality at $15.2 billion per point, and the announced bid prices it at roughly $21.3 billion (est.). The nearest peer pays about $118 billion per point, the top of the cohort pays close to $188 billion, and the listed parent's implied AI segment pays roughly $279 billion (est.). At either mark, Databricks prices at least five times below its nearest peer. That spread, not the round, is the durable fact in this note.</w:t>
       </w:r>
     </w:p>
     <w:p>
@@ -1048,7 +1039,7 @@
           <w:color w:val="262B35"/>
           <w:sz w:val="21"/>
         </w:rPr>
-        <w:t>Two dates decide the next quarter. First, the close: the company says later this summer, and we assess completion by October 31 as very likely (80-95%). Confidence: moderate; the size and terms are press-sourced and the company has not disclosed them.</w:t>
+        <w:t>Two dates will decide the next quarter of this coverage. The first is the close: the company points to later this summer, and we assess completion by October 31 as very likely (80-95%). Confidence: moderate, because the size and terms rest on press sourcing the company has not confirmed.</w:t>
       </w:r>
       <w:r>
         <w:rPr>
@@ -1066,7 +1057,7 @@
           <w:color w:val="262B35"/>
           <w:sz w:val="21"/>
         </w:rPr>
-        <w:t xml:space="preserve"> Second, the print: September to October, testing the run-rate against $6.9 billion, the margin against 70%, and the February metrics against fresh ones. The kill criterion is written. A gross-margin print below 70% by the October disclosure forces a quality re-score, round or no round. The registry stays quiet; no S-1 was on file at the last check.</w:t>
+        <w:t xml:space="preserve"> The second is the print: a September-to-October disclosure that tests the run-rate against $6.9 billion, the margin against the 70% floor, and February's metrics against fresh ones. The kill criterion is already written. A gross-margin print below 70% by the October disclosure forces a quality re-score, round or no round. The registry, meanwhile, stays quiet: no S-1 was on file at the last check.</w:t>
       </w:r>
       <w:r>
         <w:rPr>

</xml_diff>

<commit_message>
Anti-AI sentence shapes: research, doctrine, scanner, rewrite
Research addendum (PNAS Biber-feature study: instruction-tuned models use
present participial clauses at 2-5x the human rate and nominalizations at
1.5-2x; Wikipedia Signs-of-AI-writing syntax catalogue). STYLE.md gains
'Sentence shapes': the bolt-on ban (no analysis as a trailing participial or
appositive; the payload gets its own predicate; domain absolutes like 'up
80% YoY' survive), varied sentence openings, verbs over nominalizations,
rationed negative parallelism and rule-of-three, the passive restored where
topic position demands it, no that-clause subjects. QA scanner adds
participial-bolt-on, trailing-appositive ('a move that'), trailing-delta
(', 40% above ...'), and monotone-opener checks; regression-tested against
the flagged sentence. Note rewritten with varied architecture; QA 0/0.

Co-Authored-By: Claude Fable 5 <noreply@anthropic.com>
Claude-Session: https://claude.ai/code/session_01HodnyjbWZhifkSggmc88nP
</commit_message>
<xml_diff>
--- a/reports/databricks-vertical-note-2026-08-11/output/Q3_2026_Databricks_Vertical_Analyst_Note.docx
+++ b/reports/databricks-vertical-note-2026-08-11/output/Q3_2026_Databricks_Vertical_Analyst_Note.docx
@@ -423,7 +423,7 @@
           <w:color w:val="1A1A1A"/>
           <w:sz w:val="20"/>
         </w:rPr>
-        <w:t xml:space="preserve">Databricks signed a term sheet at $188 billion on July 17, 40% above its last completed mark. </w:t>
+        <w:t xml:space="preserve">On July 17, Databricks signed a term sheet at $188 billion, and the new price stands 40% above the mark it completed in February. </w:t>
       </w:r>
       <w:r>
         <w:rPr>
@@ -432,7 +432,7 @@
           <w:color w:val="1A1A1A"/>
           <w:sz w:val="20"/>
         </w:rPr>
-        <w:t>Coatue leads the round, joined by new and existing investors, and press reports put the size near $3 billion.</w:t>
+        <w:t>Coatue leads the round with new and existing investors behind it, and press reports put the size near $3 billion.</w:t>
       </w:r>
       <w:r>
         <w:rPr>
@@ -459,7 +459,7 @@
           <w:color w:val="1A1A1A"/>
           <w:sz w:val="20"/>
         </w:rPr>
-        <w:t xml:space="preserve"> The company expects to close later this summer; until funds settle, the $134 billion February mark anchors the base case.</w:t>
+        <w:t xml:space="preserve"> Until funds settle, the $134 billion February mark anchors the base case.</w:t>
       </w:r>
     </w:p>
     <w:p>
@@ -484,7 +484,7 @@
           <w:color w:val="1A1A1A"/>
           <w:sz w:val="20"/>
         </w:rPr>
-        <w:t>No operating figure moved with the announcement, so the September print will decide which multiple the buyer actually paid.</w:t>
+        <w:t>Because no operating figure moved with the announcement, the September print will decide which multiple the buyer actually paid.</w:t>
       </w:r>
       <w:r>
         <w:rPr>
@@ -509,7 +509,7 @@
           <w:color w:val="1A1A1A"/>
           <w:sz w:val="20"/>
         </w:rPr>
-        <w:t xml:space="preserve">Revenue is accelerating through $7 billion, with growth climbing across four straight prints from +50% to +80% YoY. </w:t>
+        <w:t xml:space="preserve">Four straight prints have pushed growth from +50% to +80% YoY on a run-rate that now reads $6.9 billion. </w:t>
       </w:r>
       <w:r>
         <w:rPr>
@@ -518,7 +518,7 @@
           <w:color w:val="1A1A1A"/>
           <w:sz w:val="20"/>
         </w:rPr>
-        <w:t>Gross margin is the counterweight: 74%, guided lower, and four points above the 70% floor that would force a quality re-score regardless of the round.</w:t>
+        <w:t>Gross margin runs the other way: 74% today, guided lower, four points above the 70% floor that forces a quality re-score.</w:t>
       </w:r>
       <w:r>
         <w:rPr>
@@ -543,7 +543,7 @@
           <w:color w:val="1A1A1A"/>
           <w:sz w:val="20"/>
         </w:rPr>
-        <w:t xml:space="preserve">At either mark, Databricks remains the cohort's cheapest quality-adjusted asset: $15.2 billion per point of business quality at the completed mark, roughly $21.3 billion at the announced one (est.). </w:t>
+        <w:t xml:space="preserve">At either mark, Databricks remains the cohort's cheapest quality-adjusted asset: $15.2 billion per point of business quality completed, roughly $21.3 billion announced (est.). </w:t>
       </w:r>
       <w:r>
         <w:rPr>
@@ -584,7 +584,7 @@
           <w:color w:val="262B35"/>
           <w:sz w:val="21"/>
         </w:rPr>
-        <w:t>The round spent June as a rumor and July as a fact. On July 17, Databricks signed a term sheet for a strategic round at $188 billion post-money, led by Coatue and joined by new and existing investors.</w:t>
+        <w:t>The round spent June as a rumor and July as a fact. On July 17, Databricks signed a term sheet for a strategic round at $188 billion post-money.</w:t>
       </w:r>
       <w:r>
         <w:rPr>
@@ -602,7 +602,7 @@
           <w:color w:val="262B35"/>
           <w:sz w:val="21"/>
         </w:rPr>
-        <w:t xml:space="preserve"> The company has not said how much it is raising; press reports put the figure near $3 billion.</w:t>
+        <w:t xml:space="preserve"> Coatue leads, and new and existing investors fill out the book. How much money is moving remains undisclosed; press reports put the figure near $3 billion.</w:t>
       </w:r>
       <w:r>
         <w:rPr>
@@ -620,7 +620,7 @@
           <w:color w:val="262B35"/>
           <w:sz w:val="21"/>
         </w:rPr>
-        <w:t xml:space="preserve"> Nor is the money in hand. The close is expected later this summer, and PitchBook carries the round as announced and in progress, the thirteenth in the company's history.</w:t>
+        <w:t xml:space="preserve"> Nor is the cash in hand. The company expects to close later this summer, and PitchBook carries the round as announced and in progress; it is the thirteenth in the company's history.</w:t>
       </w:r>
       <w:r>
         <w:rPr>
@@ -695,7 +695,7 @@
           <w:color w:val="262B35"/>
           <w:sz w:val="21"/>
         </w:rPr>
-        <w:t>The size carries the second. Three billion dollars is less than half of February's $7.0 billion raise, and it is being sought by a business that already funds itself from operations.</w:t>
+        <w:t>A second insight sits in the size. Where February's round raised $7.0 billion, this one seeks barely $3 billion, and the business behind both already funds itself from operations.</w:t>
       </w:r>
       <w:r>
         <w:rPr>
@@ -713,7 +713,7 @@
           <w:color w:val="262B35"/>
           <w:sz w:val="21"/>
         </w:rPr>
-        <w:t xml:space="preserve"> A company that raises small at a 40% markup is not covering a shortfall; it is setting a higher price on itself and adding reserves, on its own schedule, with the proceeds pointed at AI products: Genie, Unity AI Gateway, and Lakebase.</w:t>
+        <w:t xml:space="preserve"> A company that raises small at a 40% markup is not covering a shortfall; it is marking itself up and putting reserves away on its own schedule. The proceeds point at the AI product line: Genie, Unity AI Gateway, and Lakebase.</w:t>
       </w:r>
       <w:r>
         <w:rPr>
@@ -731,7 +731,7 @@
           <w:color w:val="262B35"/>
           <w:sz w:val="21"/>
         </w:rPr>
-        <w:t xml:space="preserve"> None of this moves the base case. An unclosed round never anchors valuation under the house rule, so $134 billion remains the working mark until funds settle. Whether the higher price is earned is a question for the operating record, and the record has an answer.</w:t>
+        <w:t xml:space="preserve"> None of this moves the base case. Under the house rule, an unclosed round never anchors valuation, so $134 billion remains the working mark until funds settle. Whether the higher price is earned is a question for the operating record, and the record has an answer.</w:t>
       </w:r>
     </w:p>
     <w:p>
@@ -810,7 +810,7 @@
           <w:color w:val="262B35"/>
           <w:sz w:val="21"/>
         </w:rPr>
-        <w:t>The record's answer is acceleration. Nothing operational moved with the announcement; the bid re-rates an engine that has grown faster with every report. The latest print stands at $6.9 billion of annualized revenue, up 80% year over year, the fourth consecutive print in which growth accelerated.</w:t>
+        <w:t>The record's answer is acceleration. Nothing operational moved with the announcement; the bid re-rates an engine that has grown faster with every report. The latest print put annualized revenue at $6.9 billion, up 80% year over year.</w:t>
       </w:r>
       <w:r>
         <w:rPr>
@@ -828,7 +828,7 @@
           <w:color w:val="262B35"/>
           <w:sz w:val="21"/>
         </w:rPr>
-        <w:t xml:space="preserve"> The ladder reads $4.0 billion, $4.8 billion, $5.4 billion, and $6.9 billion across ten months. Software companies at this scale are supposed to slow down. This one has been speeding up.</w:t>
+        <w:t xml:space="preserve"> That made four consecutive prints of accelerating growth, and the ladder tells it plainly: $4.0 billion, $4.8 billion, $5.4 billion, $6.9 billion in ten months. Software companies at this scale are supposed to slow down. This one keeps speeding up.</w:t>
       </w:r>
     </w:p>
     <w:p>

</xml_diff>